<commit_message>
Fix JS syntax error (isMissingInStandardErp) and serve jszip locally to eliminate tracking prevention
</commit_message>
<xml_diff>
--- a/Der_Baubuch_Prozess_WOBAK.docx
+++ b/Der_Baubuch_Prozess_WOBAK.docx
@@ -3965,15 +3965,15 @@
           <w:sz w:val="21"/>
           <w:color w:val="0F172A"/>
         </w:rPr>
-        <w:t xml:space="preserve">4. Fachbauleitererklärung (§ 45 LBO): </w:t>
-      </w:r>
-      <w:r>
-        <w:rPr>
-          <w:rFonts w:ascii="Calibri" w:hAnsi="Calibri"/>
-          <w:sz w:val="21"/>
-          <w:color w:val="334155"/>
-        </w:rPr>
-        <w:t xml:space="preserve">Nach § 45 LBO Baden-Württemberg muss der Auftragnehmer vor Ausführungsbeginn die rechtsverbindliche Fachbauleitererklärung einreichen.</w:t>
+        <w:t xml:space="preserve">4. Fachbauleitererklärung (§§ 42, 45 LBO): </w:t>
+      </w:r>
+      <w:r>
+        <w:rPr>
+          <w:rFonts w:ascii="Calibri" w:hAnsi="Calibri"/>
+          <w:sz w:val="21"/>
+          <w:color w:val="334155"/>
+        </w:rPr>
+        <w:t xml:space="preserve">Nach §§ 42, 45 LBO Baden-Württemberg muss der Auftragnehmer vor Ausführungsbeginn die rechtsverbindliche Fachbauleitererklärung einreichen (Verantwortung für die ordnungsgemäße Bauüberwachung des Gewerks).</w:t>
       </w:r>
     </w:p>
     <w:p>
@@ -5441,6 +5441,188 @@
         <w:t xml:space="preserve">Das nächste Grundstücksangebot, das bei Herrn Götsch eingeht (Phase 0), greift unmittelbar auf diese aktuellen, bereinigten Erfahrungswerte zu.</w:t>
       </w:r>
     </w:p>
+    <w:p>
+      <w:pPr>
+        <w:spacing w:before="260" w:after="100" w:line="260" w:lineRule="auto"/>
+      </w:pPr>
+      <w:r>
+        <w:rPr>
+          <w:rFonts w:ascii="Calibri" w:hAnsi="Calibri"/>
+          <w:b/>
+          <w:color w:val="1E3A8A"/>
+          <w:sz w:val="26"/>
+        </w:rPr>
+        <w:t xml:space="preserve">Die 5 geschlossenen Regelkreise (Closed Loops) der WOBAK</w:t>
+      </w:r>
+    </w:p>
+    <w:p>
+      <w:pPr>
+        <w:spacing w:before="0" w:after="120" w:line="260" w:lineRule="auto"/>
+      </w:pPr>
+      <w:r>
+        <w:rPr>
+          <w:rFonts w:ascii="Calibri" w:hAnsi="Calibri"/>
+          <w:color w:val="334155"/>
+          <w:sz w:val="22"/>
+        </w:rPr>
+        <w:t xml:space="preserve">Der WOBAK-Prozess ist keine statische Einbahnstraße, sondern ein dynamisches kybernetisches System mit fünf definierten Rückkopplungsschleifen:</w:t>
+      </w:r>
+    </w:p>
+    <w:p>
+      <w:pPr>
+        <w:spacing w:before="40" w:after="80" w:line="240" w:lineRule="auto"/>
+        <w:ind w:left="400" w:hanging="240"/>
+      </w:pPr>
+      <w:r>
+        <w:rPr>
+          <w:rFonts w:ascii="Calibri" w:hAnsi="Calibri"/>
+          <w:b/>
+          <w:color w:val="1E3A8A"/>
+        </w:rPr>
+        <w:t xml:space="preserve">▪ </w:t>
+      </w:r>
+      <w:r>
+        <w:rPr>
+          <w:rFonts w:ascii="Calibri" w:hAnsi="Calibri"/>
+          <w:b/>
+          <w:sz w:val="21"/>
+          <w:color w:val="0F172A"/>
+        </w:rPr>
+        <w:t xml:space="preserve">Loop 0 (Akquise-Re-Entry): </w:t>
+      </w:r>
+      <w:r>
+        <w:rPr>
+          <w:rFonts w:ascii="Calibri" w:hAnsi="Calibri"/>
+          <w:sz w:val="21"/>
+          <w:color w:val="334155"/>
+        </w:rPr>
+        <w:t xml:space="preserve">Wird ein Grundstück wegen unlösbarer Altlasten, Lärm oder überzogener Preisvorstellungen verworfen (DISCARD), stoppt die Planung sofort. Das Team kehrt ohne Fehlplanungskosten zur Sichtung des nächsten Exposés zurück.</w:t>
+      </w:r>
+    </w:p>
+    <w:p>
+      <w:pPr>
+        <w:spacing w:before="40" w:after="80" w:line="240" w:lineRule="auto"/>
+        <w:ind w:left="400" w:hanging="240"/>
+      </w:pPr>
+      <w:r>
+        <w:rPr>
+          <w:rFonts w:ascii="Calibri" w:hAnsi="Calibri"/>
+          <w:b/>
+          <w:color w:val="1E3A8A"/>
+        </w:rPr>
+        <w:t xml:space="preserve">▪ </w:t>
+      </w:r>
+      <w:r>
+        <w:rPr>
+          <w:rFonts w:ascii="Calibri" w:hAnsi="Calibri"/>
+          <w:b/>
+          <w:sz w:val="21"/>
+          <w:color w:val="0F172A"/>
+        </w:rPr>
+        <w:t xml:space="preserve">Loop 1 (Rendite-Nachschärfung): </w:t>
+      </w:r>
+      <w:r>
+        <w:rPr>
+          <w:rFonts w:ascii="Calibri" w:hAnsi="Calibri"/>
+          <w:sz w:val="21"/>
+          <w:color w:val="334155"/>
+        </w:rPr>
+        <w:t xml:space="preserve">Ergibt die Wirtschaftlichkeitsberechnung in Phase 3 eine Rendite unter 5,0 % oder eine unbezahlbare Kaltmiete (&gt; 20,20 €/m²), erfolgt keine Freigabe. Die Kubatur wird nachverdichtet oder energetisch auf KfW 40 QNG nachgeschärft (Rücksprung zu Phase 1).</w:t>
+      </w:r>
+    </w:p>
+    <w:p>
+      <w:pPr>
+        <w:spacing w:before="40" w:after="80" w:line="240" w:lineRule="auto"/>
+        <w:ind w:left="400" w:hanging="240"/>
+      </w:pPr>
+      <w:r>
+        <w:rPr>
+          <w:rFonts w:ascii="Calibri" w:hAnsi="Calibri"/>
+          <w:b/>
+          <w:color w:val="1E3A8A"/>
+        </w:rPr>
+        <w:t xml:space="preserve">▪ </w:t>
+      </w:r>
+      <w:r>
+        <w:rPr>
+          <w:rFonts w:ascii="Calibri" w:hAnsi="Calibri"/>
+          <w:b/>
+          <w:sz w:val="21"/>
+          <w:color w:val="0F172A"/>
+        </w:rPr>
+        <w:t xml:space="preserve">Loop 2 (Vergabelos-Schleife): </w:t>
+      </w:r>
+      <w:r>
+        <w:rPr>
+          <w:rFonts w:ascii="Calibri" w:hAnsi="Calibri"/>
+          <w:sz w:val="21"/>
+          <w:color w:val="334155"/>
+        </w:rPr>
+        <w:t xml:space="preserve">Die Baustelle wird nicht im Ganzen, sondern rollierend vergeben. Bei jedem der 3 bis 4 Kostenschnitte in Phase 5 wird das gewonnene Budget geprüft, bevor das nächste Vergabelos in Phase 4 freigegeben wird.</w:t>
+      </w:r>
+    </w:p>
+    <w:p>
+      <w:pPr>
+        <w:spacing w:before="40" w:after="80" w:line="240" w:lineRule="auto"/>
+        <w:ind w:left="400" w:hanging="240"/>
+      </w:pPr>
+      <w:r>
+        <w:rPr>
+          <w:rFonts w:ascii="Calibri" w:hAnsi="Calibri"/>
+          <w:b/>
+          <w:color w:val="1E3A8A"/>
+        </w:rPr>
+        <w:t xml:space="preserve">▪ </w:t>
+      </w:r>
+      <w:r>
+        <w:rPr>
+          <w:rFonts w:ascii="Calibri" w:hAnsi="Calibri"/>
+          <w:b/>
+          <w:sz w:val="21"/>
+          <w:color w:val="0F172A"/>
+        </w:rPr>
+        <w:t xml:space="preserve">Loop 3 (Gegensteuerungs-Schleife): </w:t>
+      </w:r>
+      <w:r>
+        <w:rPr>
+          <w:rFonts w:ascii="Calibri" w:hAnsi="Calibri"/>
+          <w:sz w:val="21"/>
+          <w:color w:val="334155"/>
+        </w:rPr>
+        <w:t xml:space="preserve">Signalisiert der Forecast eine Budgetüberschreitung (Ist-Kosten + Obligo &gt; Schätzung), greift das Baubuch sofort ein: Geplante Ausführungsstandards bei noch offenen Gewerken (z. B. Bodenbeläge, Außenanlagen) werden abgesenkt (Rücksprung zu Phase 2).</w:t>
+      </w:r>
+    </w:p>
+    <w:p>
+      <w:pPr>
+        <w:spacing w:before="40" w:after="80" w:line="240" w:lineRule="auto"/>
+        <w:ind w:left="400" w:hanging="240"/>
+      </w:pPr>
+      <w:r>
+        <w:rPr>
+          <w:rFonts w:ascii="Calibri" w:hAnsi="Calibri"/>
+          <w:b/>
+          <w:color w:val="1E3A8A"/>
+        </w:rPr>
+        <w:t xml:space="preserve">▪ </w:t>
+      </w:r>
+      <w:r>
+        <w:rPr>
+          <w:rFonts w:ascii="Calibri" w:hAnsi="Calibri"/>
+          <w:b/>
+          <w:sz w:val="21"/>
+          <w:color w:val="0F172A"/>
+        </w:rPr>
+        <w:t xml:space="preserve">Loop 4 (Master Closed Loop): </w:t>
+      </w:r>
+      <w:r>
+        <w:rPr>
+          <w:rFonts w:ascii="Calibri" w:hAnsi="Calibri"/>
+          <w:sz w:val="21"/>
+          <w:color w:val="334155"/>
+        </w:rPr>
+        <w:t xml:space="preserve">Nach der KEV-311-Schlussrechnung fließen die tatsächlichen Abrechnungswerte (€/m² WF und €/m³ BRI) und die realen Gewerke-Anteile zurück in die zentrale Referenzdatenbank. Sie bilden das Fundament für die nächste Grundstücksschätzung in Phase 0 und 1.</w:t>
+      </w:r>
+    </w:p>
     <w:tbl>
       <w:tblPr>
         <w:tblW w:w="9200" w:type="dxa"/>
@@ -5474,7 +5656,7 @@
                 <w:color w:val="6D28D9"/>
                 <w:sz w:val="21"/>
               </w:rPr>
-              <w:t xml:space="preserve">Der geschlossene Kreislauf der WOBAK</w:t>
+              <w:t xml:space="preserve">Der geschlossene Kreislauf der WOBAK (Die 5 Loops)</w:t>
             </w:r>
           </w:p>
           <w:p>
@@ -5487,7 +5669,7 @@
                 <w:color w:val="334155"/>
                 <w:sz w:val="20"/>
               </w:rPr>
-              <w:t xml:space="preserve">Grundstücksangebot (Phase 0) ──▶ 2-Wege-Schätzung (Phase 1) ──▶ Gewerke-Verteilung (Phase 2)</w:t>
+              <w:t xml:space="preserve">Phase 0 (Angebot &amp; Gate) ──────▶ Phase 1 (2-Wege-Schätzung) ──────▶ Phase 2 (Gewerke &amp; DIN 276)</w:t>
             </w:r>
             <w:r>
               <w:br/>
@@ -5498,7 +5680,7 @@
                 <w:color w:val="334155"/>
                 <w:sz w:val="20"/>
               </w:rPr>
-              <w:t xml:space="preserve">         ▲                                                                      │</w:t>
+              <w:t xml:space="preserve">      ▲               │                 ▲               ▲                        ▲</w:t>
             </w:r>
             <w:r>
               <w:br/>
@@ -5509,7 +5691,7 @@
                 <w:color w:val="334155"/>
                 <w:sz w:val="20"/>
               </w:rPr>
-              <w:t xml:space="preserve">         │                                                                      ▼</w:t>
+              <w:t xml:space="preserve">      │ [Loop 0]      ▼ [DISCARD]       │ [Loop 1]      │                        │ [Loop 3: Gegensteuern]</w:t>
             </w:r>
             <w:r>
               <w:br/>
@@ -5520,7 +5702,51 @@
                 <w:color w:val="334155"/>
                 <w:sz w:val="20"/>
               </w:rPr>
-              <w:t xml:space="preserve">Erfahrungsrückfluss (Phase 7) ◀── Rechnungsprüfung (Phase 6) ◀── VOB-Vergabe (Phase 4)</w:t>
+              <w:t xml:space="preserve">      └── Re-Entry ─── STOP             └── Rendite ────┘                        │</w:t>
+            </w:r>
+            <w:r>
+              <w:br/>
+            </w:r>
+            <w:r>
+              <w:rPr>
+                <w:rFonts w:ascii="Calibri" w:hAnsi="Calibri"/>
+                <w:color w:val="334155"/>
+                <w:sz w:val="20"/>
+              </w:rPr>
+              <w:t xml:space="preserve">                                                                                 │</w:t>
+            </w:r>
+            <w:r>
+              <w:br/>
+            </w:r>
+            <w:r>
+              <w:rPr>
+                <w:rFonts w:ascii="Calibri" w:hAnsi="Calibri"/>
+                <w:color w:val="334155"/>
+                <w:sz w:val="20"/>
+              </w:rPr>
+              <w:t xml:space="preserve">Phase 7 (Master Loop 4) ◀────── Phase 6 (Abnahme &amp; KEV 311) ◀────── Phase 5 (Controlling &amp; Forecast)</w:t>
+            </w:r>
+            <w:r>
+              <w:br/>
+            </w:r>
+            <w:r>
+              <w:rPr>
+                <w:rFonts w:ascii="Calibri" w:hAnsi="Calibri"/>
+                <w:color w:val="334155"/>
+                <w:sz w:val="20"/>
+              </w:rPr>
+              <w:t xml:space="preserve">      │                                                                          │</w:t>
+            </w:r>
+            <w:r>
+              <w:br/>
+            </w:r>
+            <w:r>
+              <w:rPr>
+                <w:rFonts w:ascii="Calibri" w:hAnsi="Calibri"/>
+                <w:color w:val="334155"/>
+                <w:sz w:val="20"/>
+              </w:rPr>
+              <w:t xml:space="preserve">      └───────────────────────────────────────────────────────────── [Loop 2] ───┘ (Nächstes Vergabelos)</w:t>
             </w:r>
           </w:p>
         </w:tc>

</xml_diff>